<commit_message>
Implementación del sistema de login con invitación, he olvidado la contraseña y perfil partícipe con posibilidad de ver sólo los datos de los partícipes vinculados al usuario. Sistema desarrollado en base a Superbase y a Google apps script
</commit_message>
<xml_diff>
--- a/documentación/Funcional Promocima V 2.1 - Parte 3 PlanCambios.docx
+++ b/documentación/Funcional Promocima V 2.1 - Parte 3 PlanCambios.docx
@@ -5207,30 +5207,6 @@
           <w:sz w:val="18"/>
           <w:szCs w:val="18"/>
         </w:rPr>
-      </w:pPr>
-    </w:p>
-    <w:p>
-      <w:pPr>
-        <w:spacing w:after="80"/>
-      </w:pPr>
-      <w:r>
-        <w:t xml:space="preserve">No ha llegado, pero me refiero al mensaje </w:t>
-      </w:r>
-      <w:r>
-        <w:t xml:space="preserve">que se enviará a los usuarios cuando quieran hacer un </w:t>
-      </w:r>
-      <w:proofErr w:type="spellStart"/>
-      <w:r>
-        <w:t>reset</w:t>
-      </w:r>
-      <w:proofErr w:type="spellEnd"/>
-      <w:r>
-        <w:t>, formateado al mismo estilo que el de las invitaciones</w:t>
-      </w:r>
-    </w:p>
-    <w:p>
-      <w:pPr>
-        <w:spacing w:after="80"/>
       </w:pPr>
     </w:p>
     <w:p>

</xml_diff>